<commit_message>
Review and revise SSM submission for journal fit and equation formatting
- Rewrite main Discussion opening to align physician and hospital claims with pre-specified equivalence margins.
- Convert all supplementary statistical-method variable definitions to inline Word OMML equations.
- Display MDE and equivalence-power diagnostics as Word OMML equations in supplementary note.
- Regenerate full SSM submission package from raw data via Makefile.

Co-Authored-By: Tatsuki Onishi <bougtoir@gmail.com>
</commit_message>
<xml_diff>
--- a/manuscript/ha_supplementary.docx
+++ b/manuscript/ha_supplementary.docx
@@ -173,11 +173,134 @@
       <w:r>
         <w:rPr>
           <w:rFonts w:ascii="Times New Roman" w:hAnsi="Times New Roman"/>
-          <w:b w:val="0"/>
           <w:i w:val="0"/>
           <w:sz w:val="24"/>
         </w:rPr>
-        <w:t>where alpha_s are specialty fixed effects, delta_t are wave fixed effects, litrate is closed malpractice claims per 1,000 physicians, and JOCS-CP is an obstetrics-and-gynaecology-specific indicator from 2009 onward. Standard errors are clustered by specialty and inference uses a t-distribution with G-1 degrees of freedom, where G=12.</w:t>
+        <w:t xml:space="preserve">where </w:t>
+      </w:r>
+      <w:r>
+        <w:rPr>
+          <w:rFonts w:ascii="Times New Roman" w:hAnsi="Times New Roman"/>
+          <w:i/>
+          <w:sz w:val="24"/>
+        </w:rPr>
+        <w:t>Y</w:t>
+      </w:r>
+      <w:r>
+        <w:rPr>
+          <w:rFonts w:ascii="Times New Roman" w:hAnsi="Times New Roman"/>
+          <w:i w:val="0"/>
+          <w:sz w:val="24"/>
+        </w:rPr>
+        <w:t xml:space="preserve"> is either physicians or hospitals, </w:t>
+      </w:r>
+      <m:oMath xmlns:mml="http://www.w3.org/1998/Math/MathML">
+        <m:sSub>
+          <m:e>
+            <m:r>
+              <m:t>α</m:t>
+            </m:r>
+          </m:e>
+          <m:sub>
+            <m:r>
+              <m:t>s</m:t>
+            </m:r>
+          </m:sub>
+        </m:sSub>
+      </m:oMath>
+      <w:r>
+        <w:rPr>
+          <w:rFonts w:ascii="Times New Roman" w:hAnsi="Times New Roman"/>
+          <w:i w:val="0"/>
+          <w:sz w:val="24"/>
+        </w:rPr>
+        <w:t xml:space="preserve"> are specialty fixed effects, </w:t>
+      </w:r>
+      <m:oMath xmlns:mml="http://www.w3.org/1998/Math/MathML">
+        <m:sSub>
+          <m:e>
+            <m:r>
+              <m:t>δ</m:t>
+            </m:r>
+          </m:e>
+          <m:sub>
+            <m:r>
+              <m:t>t</m:t>
+            </m:r>
+          </m:sub>
+        </m:sSub>
+      </m:oMath>
+      <w:r>
+        <w:rPr>
+          <w:rFonts w:ascii="Times New Roman" w:hAnsi="Times New Roman"/>
+          <w:i w:val="0"/>
+          <w:sz w:val="24"/>
+        </w:rPr>
+        <w:t xml:space="preserve"> are wave fixed effects, </w:t>
+      </w:r>
+      <w:r>
+        <w:rPr>
+          <w:rFonts w:ascii="Times New Roman" w:hAnsi="Times New Roman"/>
+          <w:i/>
+          <w:sz w:val="24"/>
+        </w:rPr>
+        <w:t>litrate</w:t>
+      </w:r>
+      <w:r>
+        <w:rPr>
+          <w:rFonts w:ascii="Times New Roman" w:hAnsi="Times New Roman"/>
+          <w:i w:val="0"/>
+          <w:sz w:val="24"/>
+        </w:rPr>
+        <w:t xml:space="preserve"> is closed malpractice claims per 1,000 physicians, and </w:t>
+      </w:r>
+      <w:r>
+        <w:rPr>
+          <w:rFonts w:ascii="Times New Roman" w:hAnsi="Times New Roman"/>
+          <w:i/>
+          <w:sz w:val="24"/>
+        </w:rPr>
+        <w:t>JOCS-CP</w:t>
+      </w:r>
+      <w:r>
+        <w:rPr>
+          <w:rFonts w:ascii="Times New Roman" w:hAnsi="Times New Roman"/>
+          <w:i w:val="0"/>
+          <w:sz w:val="24"/>
+        </w:rPr>
+        <w:t xml:space="preserve"> is an obstetrics-and-gynaecology-specific indicator from 2009 onward. Standard errors are clustered by specialty and inference uses a t-distribution with </w:t>
+      </w:r>
+      <w:r>
+        <w:rPr>
+          <w:rFonts w:ascii="Times New Roman" w:hAnsi="Times New Roman"/>
+          <w:i/>
+          <w:sz w:val="24"/>
+        </w:rPr>
+        <w:t>G-1</w:t>
+      </w:r>
+      <w:r>
+        <w:rPr>
+          <w:rFonts w:ascii="Times New Roman" w:hAnsi="Times New Roman"/>
+          <w:i w:val="0"/>
+          <w:sz w:val="24"/>
+        </w:rPr>
+        <w:t xml:space="preserve"> degrees of freedom, where </w:t>
+      </w:r>
+      <w:r>
+        <w:rPr>
+          <w:rFonts w:ascii="Times New Roman" w:hAnsi="Times New Roman"/>
+          <w:i/>
+          <w:sz w:val="24"/>
+        </w:rPr>
+        <w:t>G=12</w:t>
+      </w:r>
+      <w:r>
+        <w:rPr>
+          <w:rFonts w:ascii="Times New Roman" w:hAnsi="Times New Roman"/>
+          <w:i w:val="0"/>
+          <w:sz w:val="24"/>
+        </w:rPr>
+        <w:t>.</w:t>
       </w:r>
     </w:p>
     <w:p>
@@ -187,11 +310,36 @@
       <w:r>
         <w:rPr>
           <w:rFonts w:ascii="Times New Roman" w:hAnsi="Times New Roman"/>
-          <w:b w:val="0"/>
-          <w:i w:val="0"/>
           <w:sz w:val="24"/>
         </w:rPr>
-        <w:t>Equivalence testing. Two one-sided tests (TOST) evaluate whether the per-SD litigation-rate coefficient beta lies inside a pre-specified symmetric margin m. The null hypotheses are</w:t>
+        <w:t xml:space="preserve">Equivalence testing. Two one-sided tests (TOST) evaluate whether the per-SD litigation-rate coefficient </w:t>
+      </w:r>
+      <m:oMath xmlns:mml="http://www.w3.org/1998/Math/MathML">
+        <m:r>
+          <m:t>β</m:t>
+        </m:r>
+      </m:oMath>
+      <w:r>
+        <w:rPr>
+          <w:rFonts w:ascii="Times New Roman" w:hAnsi="Times New Roman"/>
+          <w:sz w:val="24"/>
+        </w:rPr>
+        <w:t xml:space="preserve"> lies inside a pre-specified symmetric margin </w:t>
+      </w:r>
+      <w:r>
+        <w:rPr>
+          <w:rFonts w:ascii="Times New Roman" w:hAnsi="Times New Roman"/>
+          <w:i/>
+          <w:sz w:val="24"/>
+        </w:rPr>
+        <w:t>m</w:t>
+      </w:r>
+      <w:r>
+        <w:rPr>
+          <w:rFonts w:ascii="Times New Roman" w:hAnsi="Times New Roman"/>
+          <w:sz w:val="24"/>
+        </w:rPr>
+        <w:t>. The null hypotheses are</w:t>
       </w:r>
     </w:p>
     <w:p>
@@ -262,7 +410,125 @@
           <w:i w:val="0"/>
           <w:sz w:val="24"/>
         </w:rPr>
-        <w:t>Power diagnostics. The minimum detectable effect (MDE) at 80% power for the per-SD coefficient is (t(0.975, df) + t(0.80, df)) x SE. The power to declare equivalence within margin m when the true effect is zero is 2 x F_t(m / SE) - 1, where F_t is the cumulative distribution function of the t(df) distribution. These quantities make the limited information in a 12-cluster panel explicit.</w:t>
+        <w:t>Power diagnostics. The minimum detectable effect (MDE) at 80% power for the per-SD coefficient is given by the following expressions, where F_t denotes the cumulative distribution function of the t(df) distribution.</w:t>
+      </w:r>
+    </w:p>
+    <w:p>
+      <w:pPr>
+        <w:jc w:val="center"/>
+      </w:pPr>
+      <m:oMath xmlns:mml="http://www.w3.org/1998/Math/MathML">
+        <m:r>
+          <m:rPr>
+            <m:nor/>
+          </m:rPr>
+          <m:t>MDE</m:t>
+        </m:r>
+        <m:r>
+          <m:t>=(</m:t>
+        </m:r>
+        <m:sSub>
+          <m:e>
+            <m:r>
+              <m:t>t</m:t>
+            </m:r>
+          </m:e>
+          <m:sub>
+            <m:r>
+              <m:t>0.975,df</m:t>
+            </m:r>
+          </m:sub>
+        </m:sSub>
+        <m:r>
+          <m:t>+</m:t>
+        </m:r>
+        <m:sSub>
+          <m:e>
+            <m:r>
+              <m:t>t</m:t>
+            </m:r>
+          </m:e>
+          <m:sub>
+            <m:r>
+              <m:t>0.80,df</m:t>
+            </m:r>
+          </m:sub>
+        </m:sSub>
+        <m:r>
+          <m:t>)×</m:t>
+        </m:r>
+        <m:r>
+          <m:rPr>
+            <m:nor/>
+          </m:rPr>
+          <m:t>SE</m:t>
+        </m:r>
+      </m:oMath>
+    </w:p>
+    <w:p>
+      <w:pPr>
+        <w:jc w:val="center"/>
+      </w:pPr>
+      <m:oMath xmlns:mml="http://www.w3.org/1998/Math/MathML">
+        <m:sSub>
+          <m:e>
+            <m:r>
+              <m:rPr>
+                <m:nor/>
+              </m:rPr>
+              <m:t>Power</m:t>
+            </m:r>
+          </m:e>
+          <m:sub>
+            <m:r>
+              <m:rPr>
+                <m:nor/>
+              </m:rPr>
+              <m:t>equiv</m:t>
+            </m:r>
+          </m:sub>
+        </m:sSub>
+        <m:r>
+          <m:t>=2·</m:t>
+        </m:r>
+        <m:sSub>
+          <m:e>
+            <m:r>
+              <m:t>F</m:t>
+            </m:r>
+          </m:e>
+          <m:sub>
+            <m:r>
+              <m:t>t</m:t>
+            </m:r>
+          </m:sub>
+        </m:sSub>
+        <m:r>
+          <m:t>(m/</m:t>
+        </m:r>
+        <m:r>
+          <m:rPr>
+            <m:nor/>
+          </m:rPr>
+          <m:t>SE</m:t>
+        </m:r>
+        <m:r>
+          <m:t>)−1</m:t>
+        </m:r>
+      </m:oMath>
+    </w:p>
+    <w:p>
+      <w:pPr>
+        <w:spacing w:line="480" w:lineRule="auto" w:after="120"/>
+      </w:pPr>
+      <w:r>
+        <w:rPr>
+          <w:rFonts w:ascii="Times New Roman" w:hAnsi="Times New Roman"/>
+          <w:b w:val="0"/>
+          <w:i w:val="0"/>
+          <w:sz w:val="24"/>
+        </w:rPr>
+        <w:t>These quantities make the limited information in a 12-cluster panel explicit.</w:t>
       </w:r>
     </w:p>
     <w:p>
@@ -428,14 +694,59 @@
       <w:pPr>
         <w:spacing w:line="480" w:lineRule="auto" w:after="120"/>
       </w:pPr>
+      <m:oMath xmlns:mml="http://www.w3.org/1998/Math/MathML">
+        <m:sSub>
+          <m:e>
+            <m:r>
+              <m:rPr>
+                <m:nor/>
+              </m:rPr>
+              <m:t>Group</m:t>
+            </m:r>
+          </m:e>
+          <m:sub>
+            <m:r>
+              <m:t>s</m:t>
+            </m:r>
+          </m:sub>
+        </m:sSub>
+      </m:oMath>
       <w:r>
         <w:rPr>
           <w:rFonts w:ascii="Times New Roman" w:hAnsi="Times New Roman"/>
-          <w:b w:val="0"/>
-          <w:i w:val="0"/>
           <w:sz w:val="24"/>
         </w:rPr>
-        <w:t>Group_s is either high-litigation (above the median specialty mean lagged litigation rate) or surgical (surgery, orthopaedics, obstetrics and gynaecology, urology). The main effect of Group is absorbed by the specialty fixed effects and is omitted. A separate stability check added specialty-specific linear trends, C(specialty) x year, to the baseline specification.</w:t>
+        <w:t xml:space="preserve"> is either high-litigation (above the median specialty mean lagged litigation rate) or surgical (surgery, orthopaedics, obstetrics and gynaecology, urology). The main effect of </w:t>
+      </w:r>
+      <m:oMath xmlns:mml="http://www.w3.org/1998/Math/MathML">
+        <m:r>
+          <m:rPr>
+            <m:nor/>
+          </m:rPr>
+          <m:t>Group</m:t>
+        </m:r>
+      </m:oMath>
+      <w:r>
+        <w:rPr>
+          <w:rFonts w:ascii="Times New Roman" w:hAnsi="Times New Roman"/>
+          <w:sz w:val="24"/>
+        </w:rPr>
+        <w:t xml:space="preserve"> is absorbed by the specialty fixed effects and is omitted. A separate stability check added specialty-specific linear trends, </w:t>
+      </w:r>
+      <w:r>
+        <w:rPr>
+          <w:rFonts w:ascii="Times New Roman" w:hAnsi="Times New Roman"/>
+          <w:i/>
+          <w:sz w:val="24"/>
+        </w:rPr>
+        <w:t>C(specialty) x year</w:t>
+      </w:r>
+      <w:r>
+        <w:rPr>
+          <w:rFonts w:ascii="Times New Roman" w:hAnsi="Times New Roman"/>
+          <w:sz w:val="24"/>
+        </w:rPr>
+        <w:t>, to the baseline specification.</w:t>
       </w:r>
     </w:p>
     <w:p>

</xml_diff>